<commit_message>
Added a disclaimer to SecondSupplementaryAffidavit
Added a disclaimer to SecondSupplementaryAffidavit such that any mistakes can be accommodated for rectification, if really necessary
</commit_message>
<xml_diff>
--- a/SecondSupplementaryAffidavit_v2_25Aug2026 (1).docx
+++ b/SecondSupplementaryAffidavit_v2_25Aug2026 (1).docx
@@ -521,7 +521,25 @@
           <w:sz w:val="22"/>
           <w:szCs w:val="22"/>
         </w:rPr>
-        <w:t>, Ratnagiri — same branch, same date of sanction (24.03.2017) as OA 122/2022.</w:t>
+        <w:t xml:space="preserve">, </w:t>
+      </w:r>
+      <w:proofErr w:type="gramStart"/>
+      <w:r>
+        <w:rPr>
+          <w:rFonts w:ascii="Arial" w:eastAsia="Arial" w:hAnsi="Arial" w:cs="Arial"/>
+          <w:sz w:val="22"/>
+          <w:szCs w:val="22"/>
+        </w:rPr>
+        <w:t>Ratnagiri — same branch,</w:t>
+      </w:r>
+      <w:proofErr w:type="gramEnd"/>
+      <w:r>
+        <w:rPr>
+          <w:rFonts w:ascii="Arial" w:eastAsia="Arial" w:hAnsi="Arial" w:cs="Arial"/>
+          <w:sz w:val="22"/>
+          <w:szCs w:val="22"/>
+        </w:rPr>
+        <w:t xml:space="preserve"> same date of sanction (24.03.2017) as OA 122/2022.</w:t>
       </w:r>
     </w:p>
     <w:p>
@@ -536,25 +554,7 @@
           <w:sz w:val="22"/>
           <w:szCs w:val="22"/>
         </w:rPr>
-        <w:t xml:space="preserve">2. OA No. 230 of 2024 — ICICI Bank Ltd. vs. Babulal </w:t>
-      </w:r>
-      <w:proofErr w:type="spellStart"/>
-      <w:r>
-        <w:rPr>
-          <w:rFonts w:ascii="Arial" w:eastAsia="Arial" w:hAnsi="Arial" w:cs="Arial"/>
-          <w:sz w:val="22"/>
-          <w:szCs w:val="22"/>
-        </w:rPr>
-        <w:t>Ganeshmalji</w:t>
-      </w:r>
-      <w:proofErr w:type="spellEnd"/>
-      <w:r>
-        <w:rPr>
-          <w:rFonts w:ascii="Arial" w:eastAsia="Arial" w:hAnsi="Arial" w:cs="Arial"/>
-          <w:sz w:val="22"/>
-          <w:szCs w:val="22"/>
-        </w:rPr>
-        <w:t xml:space="preserve"> Bohra &amp; Ors. — same primary Respondent — next date 26.11.2026 CAOD Ex </w:t>
+        <w:t xml:space="preserve">2. OA No. 230 of 2024 — ICICI Bank Ltd. vs. Babulal Ganeshmalji Bohra &amp; Ors. — same primary Respondent — next date 26.11.2026 CAOD Ex </w:t>
       </w:r>
       <w:proofErr w:type="spellStart"/>
       <w:r>
@@ -2002,7 +2002,25 @@
           <w:sz w:val="22"/>
           <w:szCs w:val="22"/>
         </w:rPr>
-        <w:t xml:space="preserve">2.  on the MCA portal — a company without directors cannot execute any legal </w:t>
+        <w:t>2</w:t>
+      </w:r>
+      <w:proofErr w:type="gramStart"/>
+      <w:r>
+        <w:rPr>
+          <w:rFonts w:ascii="Arial" w:eastAsia="Arial" w:hAnsi="Arial" w:cs="Arial"/>
+          <w:sz w:val="22"/>
+          <w:szCs w:val="22"/>
+        </w:rPr>
+        <w:t>.  on</w:t>
+      </w:r>
+      <w:proofErr w:type="gramEnd"/>
+      <w:r>
+        <w:rPr>
+          <w:rFonts w:ascii="Arial" w:eastAsia="Arial" w:hAnsi="Arial" w:cs="Arial"/>
+          <w:sz w:val="22"/>
+          <w:szCs w:val="22"/>
+        </w:rPr>
+        <w:t xml:space="preserve"> the MCA portal — a company without directors cannot execute any legal </w:t>
       </w:r>
       <w:proofErr w:type="spellStart"/>
       <w:proofErr w:type="gramStart"/>
@@ -2047,13 +2065,23 @@
         <w:spacing w:after="120"/>
         <w:jc w:val="both"/>
       </w:pPr>
-      <w:r>
-        <w:rPr>
-          <w:rFonts w:ascii="Arial" w:eastAsia="Arial" w:hAnsi="Arial" w:cs="Arial"/>
-          <w:sz w:val="22"/>
-          <w:szCs w:val="22"/>
-        </w:rPr>
-        <w:t xml:space="preserve">3.  — despite supposedly mortgaging high-value land, the company has no charge history on the MCA </w:t>
+      <w:proofErr w:type="gramStart"/>
+      <w:r>
+        <w:rPr>
+          <w:rFonts w:ascii="Arial" w:eastAsia="Arial" w:hAnsi="Arial" w:cs="Arial"/>
+          <w:sz w:val="22"/>
+          <w:szCs w:val="22"/>
+        </w:rPr>
+        <w:t>3.  — despite</w:t>
+      </w:r>
+      <w:proofErr w:type="gramEnd"/>
+      <w:r>
+        <w:rPr>
+          <w:rFonts w:ascii="Arial" w:eastAsia="Arial" w:hAnsi="Arial" w:cs="Arial"/>
+          <w:sz w:val="22"/>
+          <w:szCs w:val="22"/>
+        </w:rPr>
+        <w:t xml:space="preserve"> supposedly mortgaging high-value land, the company has no charge history on the MCA </w:t>
       </w:r>
       <w:proofErr w:type="spellStart"/>
       <w:proofErr w:type="gramStart"/>
@@ -2200,13 +2228,23 @@
         <w:spacing w:after="120"/>
         <w:jc w:val="both"/>
       </w:pPr>
-      <w:r>
-        <w:rPr>
-          <w:rFonts w:ascii="Arial" w:eastAsia="Arial" w:hAnsi="Arial" w:cs="Arial"/>
-          <w:sz w:val="22"/>
-          <w:szCs w:val="22"/>
-        </w:rPr>
-        <w:t xml:space="preserve">6.  — the Registrar of Companies has struck this company off the </w:t>
+      <w:proofErr w:type="gramStart"/>
+      <w:r>
+        <w:rPr>
+          <w:rFonts w:ascii="Arial" w:eastAsia="Arial" w:hAnsi="Arial" w:cs="Arial"/>
+          <w:sz w:val="22"/>
+          <w:szCs w:val="22"/>
+        </w:rPr>
+        <w:t>6.  — the</w:t>
+      </w:r>
+      <w:proofErr w:type="gramEnd"/>
+      <w:r>
+        <w:rPr>
+          <w:rFonts w:ascii="Arial" w:eastAsia="Arial" w:hAnsi="Arial" w:cs="Arial"/>
+          <w:sz w:val="22"/>
+          <w:szCs w:val="22"/>
+        </w:rPr>
+        <w:t xml:space="preserve"> Registrar of Companies has struck this company off the </w:t>
       </w:r>
       <w:proofErr w:type="spellStart"/>
       <w:proofErr w:type="gramStart"/>
@@ -2350,7 +2388,16 @@
           <w:sz w:val="22"/>
           <w:szCs w:val="22"/>
         </w:rPr>
-        <w:t>Companies.</w:t>
+        <w:t>Companies</w:t>
+      </w:r>
+      <w:proofErr w:type="gramStart"/>
+      <w:r>
+        <w:rPr>
+          <w:rFonts w:ascii="Arial" w:eastAsia="Arial" w:hAnsi="Arial" w:cs="Arial"/>
+          <w:sz w:val="22"/>
+          <w:szCs w:val="22"/>
+        </w:rPr>
+        <w:t>.</w:t>
       </w:r>
       <w:r>
         <w:rPr>
@@ -2365,6 +2412,7 @@
         <w:t>struck</w:t>
       </w:r>
       <w:proofErr w:type="spellEnd"/>
+      <w:proofErr w:type="gramEnd"/>
       <w:r>
         <w:rPr>
           <w:rFonts w:ascii="Arial" w:eastAsia="Arial" w:hAnsi="Arial" w:cs="Arial"/>
@@ -2670,7 +2718,25 @@
           <w:sz w:val="22"/>
           <w:szCs w:val="22"/>
         </w:rPr>
-        <w:t xml:space="preserve"> Branch — Rs. 29.5 crore ceiling (principal + interest + charges) — Status</w:t>
+        <w:t xml:space="preserve"> Branch — Rs. 29.5 crore ceiling (principal + interest + </w:t>
+      </w:r>
+      <w:proofErr w:type="gramStart"/>
+      <w:r>
+        <w:rPr>
+          <w:rFonts w:ascii="Arial" w:eastAsia="Arial" w:hAnsi="Arial" w:cs="Arial"/>
+          <w:sz w:val="22"/>
+          <w:szCs w:val="22"/>
+        </w:rPr>
+        <w:t>charges) —</w:t>
+      </w:r>
+      <w:proofErr w:type="gramEnd"/>
+      <w:r>
+        <w:rPr>
+          <w:rFonts w:ascii="Arial" w:eastAsia="Arial" w:hAnsi="Arial" w:cs="Arial"/>
+          <w:sz w:val="22"/>
+          <w:szCs w:val="22"/>
+        </w:rPr>
+        <w:t xml:space="preserve"> Status</w:t>
       </w:r>
       <w:proofErr w:type="gramStart"/>
       <w:r>
@@ -4198,25 +4264,7 @@
           <w:sz w:val="22"/>
           <w:szCs w:val="22"/>
         </w:rPr>
-        <w:t xml:space="preserve"> That page 3 of the Multipurpose Agreement for Loan (Form L-516) executed in August 2016 — BOI's own certified court document filed in OA 122/2022 — contains a handwritten self-declaration by Babulal </w:t>
-      </w:r>
-      <w:proofErr w:type="spellStart"/>
-      <w:r>
-        <w:rPr>
-          <w:rFonts w:ascii="Arial" w:eastAsia="Arial" w:hAnsi="Arial" w:cs="Arial"/>
-          <w:sz w:val="22"/>
-          <w:szCs w:val="22"/>
-        </w:rPr>
-        <w:t>Ganeshmal</w:t>
-      </w:r>
-      <w:proofErr w:type="spellEnd"/>
-      <w:r>
-        <w:rPr>
-          <w:rFonts w:ascii="Arial" w:eastAsia="Arial" w:hAnsi="Arial" w:cs="Arial"/>
-          <w:sz w:val="22"/>
-          <w:szCs w:val="22"/>
-        </w:rPr>
-        <w:t xml:space="preserve"> Bohra disclosing the following existing credit facilities at the time of applying for the home loan: (</w:t>
+        <w:t xml:space="preserve"> That page 3 of the Multipurpose Agreement for Loan (Form L-516) executed in August 2016 — BOI's own certified court document filed in OA 122/2022 — contains a handwritten self-declaration by Babulal Ganeshmal Bohra disclosing the following existing credit facilities at the time of applying for the home loan: (</w:t>
       </w:r>
       <w:proofErr w:type="spellStart"/>
       <w:r>
@@ -5437,7 +5485,25 @@
           <w:sz w:val="22"/>
           <w:szCs w:val="22"/>
         </w:rPr>
-        <w:t>. Registrar of Companies, Ahmedabad: Complete director history of Light and Glaze Profile Pvt. Ltd. (CIN U27203GJ2011PTC065583) — all DIR-12 filings, specifically any cessation record for DIN 02080079 (Srinivas Saikumar Anne</w:t>
+        <w:t xml:space="preserve">. Registrar of Companies, Ahmedabad: Complete director history of Light and Glaze Profile Pvt. Ltd. (CIN </w:t>
+      </w:r>
+      <w:proofErr w:type="gramStart"/>
+      <w:r>
+        <w:rPr>
+          <w:rFonts w:ascii="Arial" w:eastAsia="Arial" w:hAnsi="Arial" w:cs="Arial"/>
+          <w:sz w:val="22"/>
+          <w:szCs w:val="22"/>
+        </w:rPr>
+        <w:t>U27203GJ2011PTC065583) —</w:t>
+      </w:r>
+      <w:proofErr w:type="gramEnd"/>
+      <w:r>
+        <w:rPr>
+          <w:rFonts w:ascii="Arial" w:eastAsia="Arial" w:hAnsi="Arial" w:cs="Arial"/>
+          <w:sz w:val="22"/>
+          <w:szCs w:val="22"/>
+        </w:rPr>
+        <w:t xml:space="preserve"> all DIR-12 filings, specifically any cessation record for DIN 02080079 (Srinivas Saikumar Anne</w:t>
       </w:r>
       <w:proofErr w:type="gramStart"/>
       <w:r>
@@ -5514,7 +5580,25 @@
           <w:sz w:val="22"/>
           <w:szCs w:val="22"/>
         </w:rPr>
-        <w:t xml:space="preserve"> Contract Pvt. Ltd. (CIN U99999GJ1992PTC017724) — annual returns, directors, charges, and all </w:t>
+        <w:t xml:space="preserve"> Contract Pvt. Ltd. (CIN </w:t>
+      </w:r>
+      <w:proofErr w:type="gramStart"/>
+      <w:r>
+        <w:rPr>
+          <w:rFonts w:ascii="Arial" w:eastAsia="Arial" w:hAnsi="Arial" w:cs="Arial"/>
+          <w:sz w:val="22"/>
+          <w:szCs w:val="22"/>
+        </w:rPr>
+        <w:t>U99999GJ1992PTC017724) —</w:t>
+      </w:r>
+      <w:proofErr w:type="gramEnd"/>
+      <w:r>
+        <w:rPr>
+          <w:rFonts w:ascii="Arial" w:eastAsia="Arial" w:hAnsi="Arial" w:cs="Arial"/>
+          <w:sz w:val="22"/>
+          <w:szCs w:val="22"/>
+        </w:rPr>
+        <w:t xml:space="preserve"> annual returns, directors, charges, and all </w:t>
       </w:r>
       <w:proofErr w:type="spellStart"/>
       <w:r>
@@ -6235,13 +6319,23 @@
         </w:rPr>
         <w:t>4</w:t>
       </w:r>
-      <w:r>
-        <w:rPr>
-          <w:rFonts w:ascii="Arial" w:eastAsia="Arial" w:hAnsi="Arial" w:cs="Arial"/>
-          <w:sz w:val="22"/>
-          <w:szCs w:val="22"/>
-        </w:rPr>
-        <w:t xml:space="preserve">.  OA 122/2022, OA 123/2022, and OA 230/2024 for joint and consolidated hearing before the same Presiding </w:t>
+      <w:proofErr w:type="gramStart"/>
+      <w:r>
+        <w:rPr>
+          <w:rFonts w:ascii="Arial" w:eastAsia="Arial" w:hAnsi="Arial" w:cs="Arial"/>
+          <w:sz w:val="22"/>
+          <w:szCs w:val="22"/>
+        </w:rPr>
+        <w:t>.  OA</w:t>
+      </w:r>
+      <w:proofErr w:type="gramEnd"/>
+      <w:r>
+        <w:rPr>
+          <w:rFonts w:ascii="Arial" w:eastAsia="Arial" w:hAnsi="Arial" w:cs="Arial"/>
+          <w:sz w:val="22"/>
+          <w:szCs w:val="22"/>
+        </w:rPr>
+        <w:t xml:space="preserve"> 122/2022, OA 123/2022, and OA 230/2024 for joint and consolidated hearing before the same Presiding </w:t>
       </w:r>
       <w:proofErr w:type="spellStart"/>
       <w:proofErr w:type="gramStart"/>
@@ -6478,7 +6572,25 @@
           <w:sz w:val="22"/>
           <w:szCs w:val="22"/>
         </w:rPr>
-        <w:t xml:space="preserve"> in OA 122/2022 shall be kept in </w:t>
+        <w:t xml:space="preserve"> in OA 122/2022 shall be kept </w:t>
+      </w:r>
+      <w:proofErr w:type="gramStart"/>
+      <w:r>
+        <w:rPr>
+          <w:rFonts w:ascii="Arial" w:eastAsia="Arial" w:hAnsi="Arial" w:cs="Arial"/>
+          <w:sz w:val="22"/>
+          <w:szCs w:val="22"/>
+        </w:rPr>
+        <w:t>in</w:t>
+      </w:r>
+      <w:proofErr w:type="gramEnd"/>
+      <w:r>
+        <w:rPr>
+          <w:rFonts w:ascii="Arial" w:eastAsia="Arial" w:hAnsi="Arial" w:cs="Arial"/>
+          <w:sz w:val="22"/>
+          <w:szCs w:val="22"/>
+        </w:rPr>
+        <w:t xml:space="preserve"> </w:t>
       </w:r>
       <w:proofErr w:type="gramStart"/>
       <w:r>
@@ -6633,6 +6745,117 @@
     <w:p>
       <w:pPr>
         <w:spacing w:after="40"/>
+      </w:pPr>
+    </w:p>
+    <w:p>
+      <w:pPr>
+        <w:pStyle w:val="NormalWeb"/>
+        <w:rPr>
+          <w:rFonts w:ascii="Arial" w:eastAsia="Arial" w:hAnsi="Arial" w:cs="Arial"/>
+          <w:sz w:val="22"/>
+          <w:szCs w:val="22"/>
+          <w:lang w:val="en-US" w:eastAsia="en-US" w:bidi="hi-IN"/>
+        </w:rPr>
+      </w:pPr>
+      <w:r>
+        <w:rPr>
+          <w:rFonts w:ascii="Arial" w:eastAsia="Arial" w:hAnsi="Arial" w:cs="Arial"/>
+          <w:sz w:val="22"/>
+          <w:szCs w:val="22"/>
+          <w:lang w:val="en-US" w:eastAsia="en-US" w:bidi="hi-IN"/>
+        </w:rPr>
+        <w:t>That the Intervener, appearing as a Party-in-Person without legal training, has independently compiled, verified, and presented this affidavit and its supporting exhibits entirely from official Government records, certified court documents, and publicly accessible regulatory portals — spanning multiple forums, multiple RTI threads, multiple certified copy applications, and multiple simultaneous proceedings across DRT-II Mumbai, CBI Mumbai, RBI, and various Information Commissions.</w:t>
+      </w:r>
+    </w:p>
+    <w:p>
+      <w:pPr>
+        <w:pStyle w:val="NormalWeb"/>
+        <w:rPr>
+          <w:rFonts w:ascii="Arial" w:eastAsia="Arial" w:hAnsi="Arial" w:cs="Arial"/>
+          <w:sz w:val="22"/>
+          <w:szCs w:val="22"/>
+          <w:lang w:val="en-US" w:eastAsia="en-US" w:bidi="hi-IN"/>
+        </w:rPr>
+      </w:pPr>
+      <w:r>
+        <w:rPr>
+          <w:rFonts w:ascii="Arial" w:eastAsia="Arial" w:hAnsi="Arial" w:cs="Arial"/>
+          <w:sz w:val="22"/>
+          <w:szCs w:val="22"/>
+          <w:lang w:val="en-US" w:eastAsia="en-US" w:bidi="hi-IN"/>
+        </w:rPr>
+        <w:t>That given the extraordinary volume and complexity of numerical, statistical, legal, documentary, and procedural detail that this exercise has entailed — across CERSAI Asset IDs, MCA filings, revenue records, CBS statements, charge satisfaction forms, company registration numbers, RTI registration numbers, court case numbers, exhibit references, and statutory citations — the Intervener candidly acknowledges that inadvertent errors of transcription, computation, or citation may exist in this affidavit or its enclosures.</w:t>
+      </w:r>
+    </w:p>
+    <w:p>
+      <w:pPr>
+        <w:pStyle w:val="NormalWeb"/>
+        <w:rPr>
+          <w:rFonts w:ascii="Arial" w:eastAsia="Arial" w:hAnsi="Arial" w:cs="Arial"/>
+          <w:sz w:val="22"/>
+          <w:szCs w:val="22"/>
+          <w:lang w:val="en-US" w:eastAsia="en-US" w:bidi="hi-IN"/>
+        </w:rPr>
+      </w:pPr>
+      <w:r>
+        <w:rPr>
+          <w:rFonts w:ascii="Arial" w:eastAsia="Arial" w:hAnsi="Arial" w:cs="Arial"/>
+          <w:sz w:val="22"/>
+          <w:szCs w:val="22"/>
+          <w:lang w:val="en-US" w:eastAsia="en-US" w:bidi="hi-IN"/>
+        </w:rPr>
+        <w:t>That the Intervener remains firmly committed to correcting any such error upon identification, provided such correction is sought in good faith and the error materially affects the substance, spirit, or intent of the submissions made herein.</w:t>
+      </w:r>
+    </w:p>
+    <w:p>
+      <w:pPr>
+        <w:pStyle w:val="NormalWeb"/>
+        <w:rPr>
+          <w:rFonts w:ascii="Arial" w:eastAsia="Arial" w:hAnsi="Arial" w:cs="Arial"/>
+          <w:sz w:val="22"/>
+          <w:szCs w:val="22"/>
+          <w:lang w:val="en-US" w:eastAsia="en-US" w:bidi="hi-IN"/>
+        </w:rPr>
+      </w:pPr>
+      <w:r>
+        <w:rPr>
+          <w:rFonts w:ascii="Arial" w:eastAsia="Arial" w:hAnsi="Arial" w:cs="Arial"/>
+          <w:sz w:val="22"/>
+          <w:szCs w:val="22"/>
+          <w:lang w:val="en-US" w:eastAsia="en-US" w:bidi="hi-IN"/>
+        </w:rPr>
+        <w:t>That no such inadvertent error — whether of a date, a figure, a reference number, or a citation — affects or diminishes the core factual foundation of this affidavit, which rests entirely upon official Government records bearing digital signatures, QR codes, and certification stamps of the competent authorities, independently verifiable by this Hon'ble Tribunal at any time.</w:t>
+      </w:r>
+    </w:p>
+    <w:p>
+      <w:pPr>
+        <w:pStyle w:val="NormalWeb"/>
+        <w:rPr>
+          <w:rFonts w:ascii="Arial" w:eastAsia="Arial" w:hAnsi="Arial" w:cs="Arial"/>
+          <w:sz w:val="22"/>
+          <w:szCs w:val="22"/>
+          <w:lang w:val="en-US" w:eastAsia="en-US" w:bidi="hi-IN"/>
+        </w:rPr>
+      </w:pPr>
+      <w:r>
+        <w:rPr>
+          <w:rFonts w:ascii="Arial" w:eastAsia="Arial" w:hAnsi="Arial" w:cs="Arial"/>
+          <w:sz w:val="22"/>
+          <w:szCs w:val="22"/>
+          <w:lang w:val="en-US" w:eastAsia="en-US" w:bidi="hi-IN"/>
+        </w:rPr>
+        <w:t>That the Intervener respectfully submits that the spirit, intent, and good faith of these proceedings speak for themselves — and requests that this Hon'ble Tribunal receive this affidavit in the same spirit in which it has been prepared.</w:t>
+      </w:r>
+    </w:p>
+    <w:p>
+      <w:pPr>
+        <w:spacing w:after="140"/>
+        <w:jc w:val="both"/>
+        <w:rPr>
+          <w:rFonts w:ascii="Arial" w:eastAsia="Arial" w:hAnsi="Arial" w:cs="Arial"/>
+          <w:sz w:val="22"/>
+          <w:szCs w:val="22"/>
+        </w:rPr>
       </w:pPr>
     </w:p>
     <w:p>
@@ -7512,25 +7735,7 @@
                 <w:sz w:val="19"/>
                 <w:szCs w:val="19"/>
               </w:rPr>
-              <w:t xml:space="preserve">Haq </w:t>
-            </w:r>
-            <w:proofErr w:type="spellStart"/>
-            <w:r>
-              <w:rPr>
-                <w:rFonts w:ascii="Arial" w:eastAsia="Arial" w:hAnsi="Arial" w:cs="Arial"/>
-                <w:sz w:val="19"/>
-                <w:szCs w:val="19"/>
-              </w:rPr>
-              <w:t>Patrak</w:t>
-            </w:r>
-            <w:proofErr w:type="spellEnd"/>
-            <w:r>
-              <w:rPr>
-                <w:rFonts w:ascii="Arial" w:eastAsia="Arial" w:hAnsi="Arial" w:cs="Arial"/>
-                <w:sz w:val="19"/>
-                <w:szCs w:val="19"/>
-              </w:rPr>
-              <w:t xml:space="preserve"> — </w:t>
+              <w:t xml:space="preserve">Haq Patrak — </w:t>
             </w:r>
             <w:proofErr w:type="spellStart"/>
             <w:r>
@@ -12166,6 +12371,7 @@
   <w:style w:type="character" w:default="1" w:styleId="DefaultParagraphFont">
     <w:name w:val="Default Paragraph Font"/>
     <w:uiPriority w:val="1"/>
+    <w:semiHidden/>
     <w:unhideWhenUsed/>
   </w:style>
   <w:style w:type="table" w:default="1" w:styleId="TableNormal">
@@ -12271,6 +12477,22 @@
     <w:rPr>
       <w:sz w:val="20"/>
       <w:szCs w:val="20"/>
+    </w:rPr>
+  </w:style>
+  <w:style w:type="paragraph" w:styleId="NormalWeb">
+    <w:name w:val="Normal (Web)"/>
+    <w:basedOn w:val="Normal"/>
+    <w:uiPriority w:val="99"/>
+    <w:semiHidden/>
+    <w:unhideWhenUsed/>
+    <w:rsid w:val="002611BB"/>
+    <w:pPr>
+      <w:spacing w:before="100" w:beforeAutospacing="1" w:after="100" w:afterAutospacing="1"/>
+    </w:pPr>
+    <w:rPr>
+      <w:sz w:val="24"/>
+      <w:szCs w:val="24"/>
+      <w:lang w:val="en-IN" w:eastAsia="en-IN" w:bidi="ar-SA"/>
     </w:rPr>
   </w:style>
 </w:styles>

</xml_diff>

<commit_message>
Added the label for Disclaimer
Added the label for Disclaimer
</commit_message>
<xml_diff>
--- a/SecondSupplementaryAffidavit_v2_25Aug2026 (1).docx
+++ b/SecondSupplementaryAffidavit_v2_25Aug2026 (1).docx
@@ -6745,7 +6745,16 @@
     <w:p>
       <w:pPr>
         <w:spacing w:after="40"/>
-      </w:pPr>
+        <w:rPr>
+          <w:rFonts w:ascii="Arial" w:eastAsia="Arial" w:hAnsi="Arial" w:cs="Arial"/>
+        </w:rPr>
+      </w:pPr>
+      <w:r>
+        <w:rPr>
+          <w:rFonts w:ascii="Arial" w:eastAsia="Arial" w:hAnsi="Arial" w:cs="Arial"/>
+        </w:rPr>
+        <w:t>DISCLAIMER — GOOD FAITH EFFORT BY A PARTY-IN-PERSON</w:t>
+      </w:r>
     </w:p>
     <w:p>
       <w:pPr>
@@ -6914,10 +6923,16 @@
       <w:pPr>
         <w:spacing w:after="140"/>
         <w:jc w:val="both"/>
-      </w:pPr>
-      <w:r>
-        <w:rPr>
-          <w:rFonts w:ascii="Arial" w:eastAsia="Arial" w:hAnsi="Arial" w:cs="Arial"/>
+        <w:rPr>
+          <w:b/>
+          <w:bCs/>
+        </w:rPr>
+      </w:pPr>
+      <w:r>
+        <w:rPr>
+          <w:rFonts w:ascii="Arial" w:eastAsia="Arial" w:hAnsi="Arial" w:cs="Arial"/>
+          <w:b/>
+          <w:bCs/>
           <w:sz w:val="22"/>
           <w:szCs w:val="22"/>
         </w:rPr>

</xml_diff>